<commit_message>
Fix: Copy only .QBW files, remove .ND/.TLG/.DSN copying
- Removed CopyAssociatedFiles method and all calls to it
- Added explicit .qbw extension validation in CopySourceFile/CopyTargetFile
- Added logging: 'Copying .QBW file only (associated files not needed)'
- Added comments explaining why associated files are not copied
- Added Future Enhancements section to PROJECT_CONTEXT.md (GUI drag-and-drop)
</commit_message>
<xml_diff>
--- a/PROJECT_CONTEXT.docx
+++ b/PROJECT_CONTEXT.docx
@@ -2,7 +2,7 @@
 <file path=word/document.xml><?xml version="1.0" encoding="utf-8"?>
 <w:document xmlns:w="http://schemas.openxmlformats.org/wordprocessingml/2006/main" xmlns:m="http://schemas.openxmlformats.org/officeDocument/2006/math" xmlns:r="http://schemas.openxmlformats.org/officeDocument/2006/relationships" xmlns:o="urn:schemas-microsoft-com:office:office" xmlns:v="urn:schemas-microsoft-com:vml" xmlns:w10="urn:schemas-microsoft-com:office:word" xmlns:a="http://schemas.openxmlformats.org/drawingml/2006/main" xmlns:pic="http://schemas.openxmlformats.org/drawingml/2006/picture" xmlns:wp="http://schemas.openxmlformats.org/drawingml/2006/wordprocessingDrawing">
   <w:body>
-    <w:bookmarkStart w:id="38" w:name="qb-timewarp-project-context-memory"/>
+    <w:bookmarkStart w:id="40" w:name="qb-timewarp-project-context-memory"/>
     <w:p>
       <w:pPr>
         <w:pStyle w:val="Heading1"/>
@@ -2641,8 +2641,331 @@
         <w:t xml:space="preserve">: Preferences, CompanyInfo</w:t>
       </w:r>
     </w:p>
+    <w:p>
+      <w:r>
+        <w:pict>
+          <v:rect style="width:0;height:1.5pt" o:hralign="center" o:hrstd="t" o:hr="t"/>
+        </w:pict>
+      </w:r>
+    </w:p>
     <w:bookmarkEnd w:id="37"/>
+    <w:bookmarkStart w:id="39" w:name="future-enhancements"/>
+    <w:p>
+      <w:pPr>
+        <w:pStyle w:val="Heading2"/>
+      </w:pPr>
+      <w:r>
+        <w:t xml:space="preserve">Future Enhancements</w:t>
+      </w:r>
+    </w:p>
+    <w:bookmarkStart w:id="38" w:name="X940dc8a1f68de9115aaa56ab151b4c6a012410f"/>
+    <w:p>
+      <w:pPr>
+        <w:pStyle w:val="Heading3"/>
+      </w:pPr>
+      <w:r>
+        <w:t xml:space="preserve">GUI Application with Drag-and-Drop Interface</w:t>
+      </w:r>
+    </w:p>
+    <w:p>
+      <w:pPr>
+        <w:numPr>
+          <w:ilvl w:val="0"/>
+          <w:numId w:val="1012"/>
+        </w:numPr>
+        <w:pStyle w:val="Compact"/>
+      </w:pPr>
+      <w:r>
+        <w:rPr>
+          <w:bCs/>
+          <w:b/>
+        </w:rPr>
+        <w:t xml:space="preserve">Phase</w:t>
+      </w:r>
+      <w:r>
+        <w:t xml:space="preserve">: Future development (post-CLI stabilization)</w:t>
+      </w:r>
+    </w:p>
+    <w:p>
+      <w:pPr>
+        <w:numPr>
+          <w:ilvl w:val="0"/>
+          <w:numId w:val="1012"/>
+        </w:numPr>
+        <w:pStyle w:val="Compact"/>
+      </w:pPr>
+      <w:r>
+        <w:rPr>
+          <w:bCs/>
+          <w:b/>
+        </w:rPr>
+        <w:t xml:space="preserve">Concept</w:t>
+      </w:r>
+      <w:r>
+        <w:t xml:space="preserve">: Build a desktop GUI application where the customer can simply drag-and-drop their</w:t>
+      </w:r>
+      <w:r>
+        <w:t xml:space="preserve"> </w:t>
+      </w:r>
+      <w:r>
+        <w:rPr>
+          <w:rStyle w:val="VerbatimChar"/>
+        </w:rPr>
+        <w:t xml:space="preserve">.QBW</w:t>
+      </w:r>
+      <w:r>
+        <w:t xml:space="preserve"> </w:t>
+      </w:r>
+      <w:r>
+        <w:t xml:space="preserve">file directly onto the app window</w:t>
+      </w:r>
+    </w:p>
+    <w:p>
+      <w:pPr>
+        <w:numPr>
+          <w:ilvl w:val="0"/>
+          <w:numId w:val="1012"/>
+        </w:numPr>
+        <w:pStyle w:val="Compact"/>
+      </w:pPr>
+      <w:r>
+        <w:rPr>
+          <w:bCs/>
+          <w:b/>
+        </w:rPr>
+        <w:t xml:space="preserve">Benefits</w:t>
+      </w:r>
+      <w:r>
+        <w:t xml:space="preserve">:</w:t>
+      </w:r>
+    </w:p>
+    <w:p>
+      <w:pPr>
+        <w:numPr>
+          <w:ilvl w:val="1"/>
+          <w:numId w:val="1013"/>
+        </w:numPr>
+        <w:pStyle w:val="Compact"/>
+      </w:pPr>
+      <w:r>
+        <w:t xml:space="preserve">Eliminates need for customers to edit</w:t>
+      </w:r>
+      <w:r>
+        <w:t xml:space="preserve"> </w:t>
+      </w:r>
+      <w:r>
+        <w:rPr>
+          <w:rStyle w:val="VerbatimChar"/>
+        </w:rPr>
+        <w:t xml:space="preserve">appsettings.json</w:t>
+      </w:r>
+      <w:r>
+        <w:t xml:space="preserve"> </w:t>
+      </w:r>
+      <w:r>
+        <w:t xml:space="preserve">or use command-line arguments</w:t>
+      </w:r>
+    </w:p>
+    <w:p>
+      <w:pPr>
+        <w:numPr>
+          <w:ilvl w:val="1"/>
+          <w:numId w:val="1013"/>
+        </w:numPr>
+        <w:pStyle w:val="Compact"/>
+      </w:pPr>
+      <w:r>
+        <w:t xml:space="preserve">Intuitive workflow: drag source</w:t>
+      </w:r>
+      <w:r>
+        <w:t xml:space="preserve"> </w:t>
+      </w:r>
+      <w:r>
+        <w:rPr>
+          <w:rStyle w:val="VerbatimChar"/>
+        </w:rPr>
+        <w:t xml:space="preserve">.QBW</w:t>
+      </w:r>
+      <w:r>
+        <w:t xml:space="preserve"> </w:t>
+      </w:r>
+      <w:r>
+        <w:t xml:space="preserve">→ drag target</w:t>
+      </w:r>
+      <w:r>
+        <w:t xml:space="preserve"> </w:t>
+      </w:r>
+      <w:r>
+        <w:rPr>
+          <w:rStyle w:val="VerbatimChar"/>
+        </w:rPr>
+        <w:t xml:space="preserve">.QBW</w:t>
+      </w:r>
+      <w:r>
+        <w:t xml:space="preserve"> </w:t>
+      </w:r>
+      <w:r>
+        <w:t xml:space="preserve">→ click</w:t>
+      </w:r>
+      <w:r>
+        <w:t xml:space="preserve"> </w:t>
+      </w:r>
+      <w:r>
+        <w:t xml:space="preserve">“</w:t>
+      </w:r>
+      <w:r>
+        <w:t xml:space="preserve">Migrate</w:t>
+      </w:r>
+      <w:r>
+        <w:t xml:space="preserve">”</w:t>
+      </w:r>
+    </w:p>
+    <w:p>
+      <w:pPr>
+        <w:numPr>
+          <w:ilvl w:val="1"/>
+          <w:numId w:val="1013"/>
+        </w:numPr>
+        <w:pStyle w:val="Compact"/>
+      </w:pPr>
+      <w:r>
+        <w:t xml:space="preserve">Visual progress indicators, real-time log viewer, and validation summary dashboard</w:t>
+      </w:r>
+    </w:p>
+    <w:p>
+      <w:pPr>
+        <w:numPr>
+          <w:ilvl w:val="0"/>
+          <w:numId w:val="1012"/>
+        </w:numPr>
+        <w:pStyle w:val="Compact"/>
+      </w:pPr>
+      <w:r>
+        <w:rPr>
+          <w:bCs/>
+          <w:b/>
+        </w:rPr>
+        <w:t xml:space="preserve">Technical Notes</w:t>
+      </w:r>
+      <w:r>
+        <w:t xml:space="preserve">:</w:t>
+      </w:r>
+    </w:p>
+    <w:p>
+      <w:pPr>
+        <w:numPr>
+          <w:ilvl w:val="1"/>
+          <w:numId w:val="1014"/>
+        </w:numPr>
+        <w:pStyle w:val="Compact"/>
+      </w:pPr>
+      <w:r>
+        <w:t xml:space="preserve">Consider WPF or WinForms for Windows-native drag-and-drop support</w:t>
+      </w:r>
+    </w:p>
+    <w:p>
+      <w:pPr>
+        <w:numPr>
+          <w:ilvl w:val="1"/>
+          <w:numId w:val="1014"/>
+        </w:numPr>
+        <w:pStyle w:val="Compact"/>
+      </w:pPr>
+      <w:r>
+        <w:t xml:space="preserve">Reuse existing service layer (</w:t>
+      </w:r>
+      <w:r>
+        <w:rPr>
+          <w:rStyle w:val="VerbatimChar"/>
+        </w:rPr>
+        <w:t xml:space="preserve">DataExporter</w:t>
+      </w:r>
+      <w:r>
+        <w:t xml:space="preserve">,</w:t>
+      </w:r>
+      <w:r>
+        <w:t xml:space="preserve"> </w:t>
+      </w:r>
+      <w:r>
+        <w:rPr>
+          <w:rStyle w:val="VerbatimChar"/>
+        </w:rPr>
+        <w:t xml:space="preserve">DataTransformer</w:t>
+      </w:r>
+      <w:r>
+        <w:t xml:space="preserve">,</w:t>
+      </w:r>
+      <w:r>
+        <w:t xml:space="preserve"> </w:t>
+      </w:r>
+      <w:r>
+        <w:rPr>
+          <w:rStyle w:val="VerbatimChar"/>
+        </w:rPr>
+        <w:t xml:space="preserve">DataImporter</w:t>
+      </w:r>
+      <w:r>
+        <w:t xml:space="preserve">,</w:t>
+      </w:r>
+      <w:r>
+        <w:t xml:space="preserve"> </w:t>
+      </w:r>
+      <w:r>
+        <w:rPr>
+          <w:rStyle w:val="VerbatimChar"/>
+        </w:rPr>
+        <w:t xml:space="preserve">DataValidator</w:t>
+      </w:r>
+      <w:r>
+        <w:t xml:space="preserve">)</w:t>
+      </w:r>
+    </w:p>
+    <w:p>
+      <w:pPr>
+        <w:numPr>
+          <w:ilvl w:val="1"/>
+          <w:numId w:val="1014"/>
+        </w:numPr>
+        <w:pStyle w:val="Compact"/>
+      </w:pPr>
+      <w:r>
+        <w:t xml:space="preserve">GUI wraps the same pipeline — no migration logic changes needed</w:t>
+      </w:r>
+    </w:p>
+    <w:p>
+      <w:pPr>
+        <w:numPr>
+          <w:ilvl w:val="1"/>
+          <w:numId w:val="1014"/>
+        </w:numPr>
+        <w:pStyle w:val="Compact"/>
+      </w:pPr>
+      <w:r>
+        <w:t xml:space="preserve">Working copy system operates transparently behind the GUI</w:t>
+      </w:r>
+    </w:p>
+    <w:p>
+      <w:pPr>
+        <w:numPr>
+          <w:ilvl w:val="0"/>
+          <w:numId w:val="1012"/>
+        </w:numPr>
+        <w:pStyle w:val="Compact"/>
+      </w:pPr>
+      <w:r>
+        <w:rPr>
+          <w:bCs/>
+          <w:b/>
+        </w:rPr>
+        <w:t xml:space="preserve">Priority</w:t>
+      </w:r>
+      <w:r>
+        <w:t xml:space="preserve">: After CLI pipeline is fully tested and deployed</w:t>
+      </w:r>
+    </w:p>
     <w:bookmarkEnd w:id="38"/>
+    <w:bookmarkEnd w:id="39"/>
+    <w:bookmarkEnd w:id="40"/>
     <w:sectPr/>
   </w:body>
 </w:document>
@@ -2971,6 +3294,15 @@
     </w:lvlOverride>
   </w:num>
   <w:num w:numId="1011">
+    <w:abstractNumId w:val="991"/>
+  </w:num>
+  <w:num w:numId="1012">
+    <w:abstractNumId w:val="991"/>
+  </w:num>
+  <w:num w:numId="1013">
+    <w:abstractNumId w:val="991"/>
+  </w:num>
+  <w:num w:numId="1014">
     <w:abstractNumId w:val="991"/>
   </w:num>
 </w:numbering>

</xml_diff>